<commit_message>
Final documentation and final changes to the project
</commit_message>
<xml_diff>
--- a/App_Dev_Project_Report.docx
+++ b/App_Dev_Project_Report.docx
@@ -3012,17 +3012,7 @@
           <w:sz w:val="20"/>
           <w:szCs w:val="20"/>
         </w:rPr>
-        <w:t>Architecture Overview</w:t>
-      </w:r>
-      <w:r>
-        <w:rPr>
-          <w:rFonts w:ascii="Times New Roman" w:hAnsi="Times New Roman" w:cs="Times New Roman"/>
-          <w:b/>
-          <w:bCs/>
-          <w:sz w:val="20"/>
-          <w:szCs w:val="20"/>
-        </w:rPr>
-        <w:t>:</w:t>
+        <w:t>Architecture Overview:</w:t>
       </w:r>
     </w:p>
     <w:p>
@@ -3528,8 +3518,45 @@
         <w:ind w:left="0"/>
         <w:rPr>
           <w:rFonts w:ascii="Times New Roman" w:hAnsi="Times New Roman" w:cs="Times New Roman"/>
-          <w:b/>
-          <w:bCs/>
+          <w:sz w:val="20"/>
+          <w:szCs w:val="20"/>
+        </w:rPr>
+      </w:pPr>
+      <w:hyperlink r:id="rId6" w:history="1">
+        <w:r>
+          <w:rPr>
+            <w:rStyle w:val="Hyperlink"/>
+            <w:rFonts w:ascii="Times New Roman" w:hAnsi="Times New Roman" w:cs="Times New Roman"/>
+            <w:sz w:val="20"/>
+            <w:szCs w:val="20"/>
+          </w:rPr>
+          <w:t>https://drive.google.com/file/d/1wMn5UGP6-UI4o3E6m-nummeq5zS1b</w:t>
+        </w:r>
+        <w:r>
+          <w:rPr>
+            <w:rStyle w:val="Hyperlink"/>
+            <w:rFonts w:ascii="Times New Roman" w:hAnsi="Times New Roman" w:cs="Times New Roman"/>
+            <w:sz w:val="20"/>
+            <w:szCs w:val="20"/>
+          </w:rPr>
+          <w:t>C</w:t>
+        </w:r>
+        <w:r>
+          <w:rPr>
+            <w:rStyle w:val="Hyperlink"/>
+            <w:rFonts w:ascii="Times New Roman" w:hAnsi="Times New Roman" w:cs="Times New Roman"/>
+            <w:sz w:val="20"/>
+            <w:szCs w:val="20"/>
+          </w:rPr>
+          <w:t>Mk/view?usp=share_link</w:t>
+        </w:r>
+      </w:hyperlink>
+    </w:p>
+    <w:p>
+      <w:pPr>
+        <w:ind w:left="0"/>
+        <w:rPr>
+          <w:rFonts w:ascii="Times New Roman" w:hAnsi="Times New Roman" w:cs="Times New Roman"/>
           <w:sz w:val="20"/>
           <w:szCs w:val="20"/>
         </w:rPr>
@@ -5301,6 +5328,41 @@
     <w:basedOn w:val="DefaultParagraphFont"/>
     <w:rsid w:val="006D2C2F"/>
   </w:style>
+  <w:style w:type="character" w:styleId="Hyperlink">
+    <w:name w:val="Hyperlink"/>
+    <w:basedOn w:val="DefaultParagraphFont"/>
+    <w:uiPriority w:val="99"/>
+    <w:unhideWhenUsed/>
+    <w:rsid w:val="00E561E5"/>
+    <w:rPr>
+      <w:color w:val="467886" w:themeColor="hyperlink"/>
+      <w:u w:val="single"/>
+    </w:rPr>
+  </w:style>
+  <w:style w:type="character" w:styleId="UnresolvedMention">
+    <w:name w:val="Unresolved Mention"/>
+    <w:basedOn w:val="DefaultParagraphFont"/>
+    <w:uiPriority w:val="99"/>
+    <w:semiHidden/>
+    <w:unhideWhenUsed/>
+    <w:rsid w:val="00E561E5"/>
+    <w:rPr>
+      <w:color w:val="605E5C"/>
+      <w:shd w:val="clear" w:color="auto" w:fill="E1DFDD"/>
+    </w:rPr>
+  </w:style>
+  <w:style w:type="character" w:styleId="FollowedHyperlink">
+    <w:name w:val="FollowedHyperlink"/>
+    <w:basedOn w:val="DefaultParagraphFont"/>
+    <w:uiPriority w:val="99"/>
+    <w:semiHidden/>
+    <w:unhideWhenUsed/>
+    <w:rsid w:val="00E561E5"/>
+    <w:rPr>
+      <w:color w:val="96607D" w:themeColor="followedHyperlink"/>
+      <w:u w:val="single"/>
+    </w:rPr>
+  </w:style>
 </w:styles>
 </file>
 

</xml_diff>